<commit_message>
Aggiunge art. 9.4 - limite temporale inserimento formazione
Co-Authored-By: Claude Opus 4.8 <noreply@anthropic.com>
</commit_message>
<xml_diff>
--- a/originali/Regolamento Fantacluster 2025-2026.docx
+++ b/originali/Regolamento Fantacluster 2025-2026.docx
@@ -5892,6 +5892,31 @@
           <w:lang w:val="it-IT"/>
         </w:rPr>
         <w:t>).</w:t>
+      </w:r>
+    </w:p>
+    <w:p>
+      <w:pPr>
+        <w:pStyle w:val="Paragrafoelenco"/>
+        <w:numPr>
+          <w:ilvl w:val="1"/>
+          <w:numId w:val="5"/>
+        </w:numPr>
+        <w:spacing w:after="0"/>
+        <w:ind w:left="851"/>
+        <w:jc w:val="both"/>
+        <w:rPr>
+          <w:sz w:val="20"/>
+          <w:szCs w:val="20"/>
+          <w:lang w:val="it-IT"/>
+        </w:rPr>
+      </w:pPr>
+      <w:r>
+        <w:rPr>
+          <w:sz w:val="20"/>
+          <w:szCs w:val="20"/>
+          <w:lang w:val="it-IT"/>
+        </w:rPr>
+        <w:t xml:space="preserve">Il limite temporale per l’inserimento e la modifica della formazione coincide con l’inizio della giornata (fischio d’inizio della prima gara del turno). Trascorso tale termine non è più consentita alcuna modifica alla formazione schierata.</w:t>
       </w:r>
     </w:p>
     <w:p>

</xml_diff>

<commit_message>
Conferme: aggiunge comma 4.5.5 (dichiarazione del contratto in chiamata)
Nuovo sotto-comma 4.5.5 all'art. 4.5 (conferme): obbligo di esplicitare
durante il rilancio che la chiamata e' fatta con contratto. L'ex 4.5.5
("alla data del presente documento... TBD") scala a 4.5.6; aggiornato il
riferimento nella nota di front matter. Allineati Markdown, sito e docx
(la modifica al docx e' quella inserita in Word dall'utente).

Co-Authored-By: Claude Opus 4.8 <noreply@anthropic.com>
</commit_message>
<xml_diff>
--- a/originali/Regolamento Fantacluster 2025-2026.docx
+++ b/originali/Regolamento Fantacluster 2025-2026.docx
@@ -1,6 +1,6 @@
 
 <file path=word/document.xml><?xml version="1.0" encoding="utf-8"?>
-<w:document xmlns:wpc="http://schemas.microsoft.com/office/word/2010/wordprocessingCanvas" xmlns:cx="http://schemas.microsoft.com/office/drawing/2014/chartex" xmlns:cx1="http://schemas.microsoft.com/office/drawing/2015/9/8/chartex" xmlns:cx2="http://schemas.microsoft.com/office/drawing/2015/10/21/chartex" xmlns:cx3="http://schemas.microsoft.com/office/drawing/2016/5/9/chartex" xmlns:cx4="http://schemas.microsoft.com/office/drawing/2016/5/10/chartex" xmlns:cx5="http://schemas.microsoft.com/office/drawing/2016/5/11/chartex" xmlns:cx6="http://schemas.microsoft.com/office/drawing/2016/5/12/chartex" xmlns:cx7="http://schemas.microsoft.com/office/drawing/2016/5/13/chartex" xmlns:cx8="http://schemas.microsoft.com/office/drawing/2016/5/14/chartex" xmlns:mc="http://schemas.openxmlformats.org/markup-compatibility/2006" xmlns:aink="http://schemas.microsoft.com/office/drawing/2016/ink" xmlns:am3d="http://schemas.microsoft.com/office/drawing/2017/model3d" xmlns:o="urn:schemas-microsoft-com:office:office" xmlns:oel="http://schemas.microsoft.com/office/2019/extlst" xmlns:r="http://schemas.openxmlformats.org/officeDocument/2006/relationships" xmlns:m="http://schemas.openxmlformats.org/officeDocument/2006/math" xmlns:v="urn:schemas-microsoft-com:vml" xmlns:wp14="http://schemas.microsoft.com/office/word/2010/wordprocessingDrawing" xmlns:wp="http://schemas.openxmlformats.org/drawingml/2006/wordprocessingDrawing" xmlns:w10="urn:schemas-microsoft-com:office:word" xmlns:w="http://schemas.openxmlformats.org/wordprocessingml/2006/main" xmlns:w14="http://schemas.microsoft.com/office/word/2010/wordml" xmlns:w15="http://schemas.microsoft.com/office/word/2012/wordml" xmlns:w16cex="http://schemas.microsoft.com/office/word/2018/wordml/cex" xmlns:w16cid="http://schemas.microsoft.com/office/word/2016/wordml/cid" xmlns:w16="http://schemas.microsoft.com/office/word/2018/wordml" xmlns:w16du="http://schemas.microsoft.com/office/word/2023/wordml/word16du" xmlns:w16sdtdh="http://schemas.microsoft.com/office/word/2020/wordml/sdtdatahash" xmlns:w16sdtfl="http://schemas.microsoft.com/office/word/2024/wordml/sdtformatlock" xmlns:w16se="http://schemas.microsoft.com/office/word/2015/wordml/symex" xmlns:wpg="http://schemas.microsoft.com/office/word/2010/wordprocessingGroup" xmlns:wpi="http://schemas.microsoft.com/office/word/2010/wordprocessingInk" xmlns:wne="http://schemas.microsoft.com/office/word/2006/wordml" xmlns:wps="http://schemas.microsoft.com/office/word/2010/wordprocessingShape" mc:Ignorable="w14 w15 w16se w16cid w16 w16cex w16sdtdh w16sdtfl w16du wp14">
+<w:document xmlns:wpc="http://schemas.microsoft.com/office/word/2010/wordprocessingCanvas" xmlns:cx="http://schemas.microsoft.com/office/drawing/2014/chartex" xmlns:cx1="http://schemas.microsoft.com/office/drawing/2015/9/8/chartex" xmlns:cx2="http://schemas.microsoft.com/office/drawing/2015/10/21/chartex" xmlns:cx3="http://schemas.microsoft.com/office/drawing/2016/5/9/chartex" xmlns:cx4="http://schemas.microsoft.com/office/drawing/2016/5/10/chartex" xmlns:cx5="http://schemas.microsoft.com/office/drawing/2016/5/11/chartex" xmlns:cx6="http://schemas.microsoft.com/office/drawing/2016/5/12/chartex" xmlns:cx7="http://schemas.microsoft.com/office/drawing/2016/5/13/chartex" xmlns:cx8="http://schemas.microsoft.com/office/drawing/2016/5/14/chartex" xmlns:mc="http://schemas.openxmlformats.org/markup-compatibility/2006" xmlns:aink="http://schemas.microsoft.com/office/drawing/2016/ink" xmlns:am3d="http://schemas.microsoft.com/office/drawing/2017/model3d" xmlns:o="urn:schemas-microsoft-com:office:office" xmlns:oel="http://schemas.microsoft.com/office/2019/extlst" xmlns:r="http://schemas.openxmlformats.org/officeDocument/2006/relationships" xmlns:m="http://schemas.openxmlformats.org/officeDocument/2006/math" xmlns:v="urn:schemas-microsoft-com:vml" xmlns:wp14="http://schemas.microsoft.com/office/word/2010/wordprocessingDrawing" xmlns:wp="http://schemas.openxmlformats.org/drawingml/2006/wordprocessingDrawing" xmlns:w10="urn:schemas-microsoft-com:office:word" xmlns:w="http://schemas.openxmlformats.org/wordprocessingml/2006/main" xmlns:w14="http://schemas.microsoft.com/office/word/2010/wordml" xmlns:w15="http://schemas.microsoft.com/office/word/2012/wordml" xmlns:w16cei="http://schemas.microsoft.com/office/word/2026/wordml/cei" xmlns:w16cex="http://schemas.microsoft.com/office/word/2018/wordml/cex" xmlns:w16cid="http://schemas.microsoft.com/office/word/2016/wordml/cid" xmlns:w16="http://schemas.microsoft.com/office/word/2018/wordml" xmlns:w16du="http://schemas.microsoft.com/office/word/2023/wordml/word16du" xmlns:w16sdtdh="http://schemas.microsoft.com/office/word/2020/wordml/sdtdatahash" xmlns:w16sdtfl="http://schemas.microsoft.com/office/word/2024/wordml/sdtformatlock" xmlns:w16se="http://schemas.microsoft.com/office/word/2015/wordml/symex" xmlns:wpg="http://schemas.microsoft.com/office/word/2010/wordprocessingGroup" xmlns:wpi="http://schemas.microsoft.com/office/word/2010/wordprocessingInk" xmlns:wne="http://schemas.microsoft.com/office/word/2006/wordml" xmlns:wps="http://schemas.microsoft.com/office/word/2010/wordprocessingShape" mc:Ignorable="w14 w15 w16se w16cid w16 w16cex w16sdtdh w16sdtfl w16du wp14">
   <w:body>
     <w:p>
       <w:pPr>
@@ -3569,6 +3569,39 @@
           <w:szCs w:val="20"/>
           <w:lang w:val="it-IT"/>
         </w:rPr>
+        <w:t>Obbligatorio esplicitare durante il rilancio che viene fatto con contratto. Non può essere fatto a posteriori dopo chiusura asta. (Es: Offro 1 con contratto -&gt; 3</w:t>
+      </w:r>
+      <w:r>
+        <w:rPr>
+          <w:sz w:val="20"/>
+          <w:szCs w:val="20"/>
+          <w:lang w:val="it-IT"/>
+        </w:rPr>
+        <w:t>. Chi vuole rilanciare, basta dire 2)</w:t>
+      </w:r>
+    </w:p>
+    <w:p>
+      <w:pPr>
+        <w:pStyle w:val="Paragrafoelenco"/>
+        <w:numPr>
+          <w:ilvl w:val="2"/>
+          <w:numId w:val="5"/>
+        </w:numPr>
+        <w:spacing w:after="0"/>
+        <w:ind w:left="1701"/>
+        <w:jc w:val="both"/>
+        <w:rPr>
+          <w:sz w:val="20"/>
+          <w:szCs w:val="20"/>
+          <w:lang w:val="it-IT"/>
+        </w:rPr>
+      </w:pPr>
+      <w:r>
+        <w:rPr>
+          <w:sz w:val="20"/>
+          <w:szCs w:val="20"/>
+          <w:lang w:val="it-IT"/>
+        </w:rPr>
         <w:t>alla data del presente documento</w:t>
       </w:r>
       <w:r>
@@ -3738,7 +3771,6 @@
           <w:szCs w:val="20"/>
           <w:lang w:val="it-IT"/>
         </w:rPr>
-        <w:lastRenderedPageBreak/>
         <w:t xml:space="preserve">Nel caso in cui un giocatore venga </w:t>
       </w:r>
       <w:r>
@@ -4497,6 +4529,7 @@
           <w:szCs w:val="20"/>
           <w:lang w:val="it-IT"/>
         </w:rPr>
+        <w:lastRenderedPageBreak/>
         <w:t xml:space="preserve">può chiamare un giocatore, </w:t>
       </w:r>
       <w:r>
@@ -5121,22 +5154,7 @@
           <w:szCs w:val="20"/>
           <w:lang w:val="it-IT"/>
         </w:rPr>
-        <w:t xml:space="preserve"> e, fermo restando quanto previsto dall’art. 11.2</w:t>
-      </w:r>
-      <w:r>
-        <w:rPr>
-          <w:sz w:val="20"/>
-          <w:szCs w:val="20"/>
-          <w:lang w:val="it-IT"/>
-        </w:rPr>
-      </w:r>
-      <w:r>
-        <w:rPr>
-          <w:sz w:val="20"/>
-          <w:szCs w:val="20"/>
-          <w:lang w:val="it-IT"/>
-        </w:rPr>
-        <w:t xml:space="preserve">., </w:t>
+        <w:t xml:space="preserve"> e, fermo restando quanto previsto dall’art. 11.2., </w:t>
       </w:r>
       <w:r>
         <w:rPr>
@@ -5285,20 +5303,6 @@
           <w:szCs w:val="20"/>
           <w:lang w:val="it-IT"/>
         </w:rPr>
-      </w:r>
-      <w:r>
-        <w:rPr>
-          <w:sz w:val="20"/>
-          <w:szCs w:val="20"/>
-          <w:lang w:val="it-IT"/>
-        </w:rPr>
-      </w:r>
-      <w:r>
-        <w:rPr>
-          <w:sz w:val="20"/>
-          <w:szCs w:val="20"/>
-          <w:lang w:val="it-IT"/>
-        </w:rPr>
         <w:t xml:space="preserve"> (</w:t>
       </w:r>
       <w:r>
@@ -5342,7 +5346,7 @@
           <w:szCs w:val="20"/>
           <w:lang w:val="it-IT"/>
         </w:rPr>
-        <w:t xml:space="preserve">Il limite temporale per l’inserimento e la modifica della formazione coincide con l’inizio della giornata (fischio d’inizio della prima gara del turno). Trascorso tale termine non è più consentita alcuna modifica alla formazione schierata.</w:t>
+        <w:t>Il limite temporale per l’inserimento e la modifica della formazione coincide con l’inizio della giornata (fischio d’inizio della prima gara del turno). Trascorso tale termine non è più consentita alcuna modifica alla formazione schierata.</w:t>
       </w:r>
     </w:p>
     <w:p>
@@ -7049,7 +7053,6 @@
           <w:szCs w:val="20"/>
           <w:lang w:val="it-IT"/>
         </w:rPr>
-        <w:lastRenderedPageBreak/>
         <w:t xml:space="preserve">Il </w:t>
       </w:r>
       <w:r>
@@ -7366,13 +7369,6 @@
           <w:lang w:val="it-IT"/>
         </w:rPr>
         <w:t>di cui all’art. 10</w:t>
-      </w:r>
-      <w:r>
-        <w:rPr>
-          <w:sz w:val="20"/>
-          <w:szCs w:val="20"/>
-          <w:lang w:val="it-IT"/>
-        </w:rPr>
       </w:r>
       <w:r>
         <w:rPr>
@@ -9331,7 +9327,7 @@
 </file>
 
 <file path=word/endnotes.xml><?xml version="1.0" encoding="utf-8"?>
-<w:endnotes xmlns:wpc="http://schemas.microsoft.com/office/word/2010/wordprocessingCanvas" xmlns:cx="http://schemas.microsoft.com/office/drawing/2014/chartex" xmlns:cx1="http://schemas.microsoft.com/office/drawing/2015/9/8/chartex" xmlns:cx2="http://schemas.microsoft.com/office/drawing/2015/10/21/chartex" xmlns:cx3="http://schemas.microsoft.com/office/drawing/2016/5/9/chartex" xmlns:cx4="http://schemas.microsoft.com/office/drawing/2016/5/10/chartex" xmlns:cx5="http://schemas.microsoft.com/office/drawing/2016/5/11/chartex" xmlns:cx6="http://schemas.microsoft.com/office/drawing/2016/5/12/chartex" xmlns:cx7="http://schemas.microsoft.com/office/drawing/2016/5/13/chartex" xmlns:cx8="http://schemas.microsoft.com/office/drawing/2016/5/14/chartex" xmlns:mc="http://schemas.openxmlformats.org/markup-compatibility/2006" xmlns:aink="http://schemas.microsoft.com/office/drawing/2016/ink" xmlns:am3d="http://schemas.microsoft.com/office/drawing/2017/model3d" xmlns:o="urn:schemas-microsoft-com:office:office" xmlns:oel="http://schemas.microsoft.com/office/2019/extlst" xmlns:r="http://schemas.openxmlformats.org/officeDocument/2006/relationships" xmlns:m="http://schemas.openxmlformats.org/officeDocument/2006/math" xmlns:v="urn:schemas-microsoft-com:vml" xmlns:wp14="http://schemas.microsoft.com/office/word/2010/wordprocessingDrawing" xmlns:wp="http://schemas.openxmlformats.org/drawingml/2006/wordprocessingDrawing" xmlns:w10="urn:schemas-microsoft-com:office:word" xmlns:w="http://schemas.openxmlformats.org/wordprocessingml/2006/main" xmlns:w14="http://schemas.microsoft.com/office/word/2010/wordml" xmlns:w15="http://schemas.microsoft.com/office/word/2012/wordml" xmlns:w16cex="http://schemas.microsoft.com/office/word/2018/wordml/cex" xmlns:w16cid="http://schemas.microsoft.com/office/word/2016/wordml/cid" xmlns:w16="http://schemas.microsoft.com/office/word/2018/wordml" xmlns:w16du="http://schemas.microsoft.com/office/word/2023/wordml/word16du" xmlns:w16sdtdh="http://schemas.microsoft.com/office/word/2020/wordml/sdtdatahash" xmlns:w16sdtfl="http://schemas.microsoft.com/office/word/2024/wordml/sdtformatlock" xmlns:w16se="http://schemas.microsoft.com/office/word/2015/wordml/symex" xmlns:wpg="http://schemas.microsoft.com/office/word/2010/wordprocessingGroup" xmlns:wpi="http://schemas.microsoft.com/office/word/2010/wordprocessingInk" xmlns:wne="http://schemas.microsoft.com/office/word/2006/wordml" xmlns:wps="http://schemas.microsoft.com/office/word/2010/wordprocessingShape" mc:Ignorable="w14 w15 w16se w16cid w16 w16cex w16sdtdh w16sdtfl w16du wp14">
+<w:endnotes xmlns:wpc="http://schemas.microsoft.com/office/word/2010/wordprocessingCanvas" xmlns:cx="http://schemas.microsoft.com/office/drawing/2014/chartex" xmlns:cx1="http://schemas.microsoft.com/office/drawing/2015/9/8/chartex" xmlns:cx2="http://schemas.microsoft.com/office/drawing/2015/10/21/chartex" xmlns:cx3="http://schemas.microsoft.com/office/drawing/2016/5/9/chartex" xmlns:cx4="http://schemas.microsoft.com/office/drawing/2016/5/10/chartex" xmlns:cx5="http://schemas.microsoft.com/office/drawing/2016/5/11/chartex" xmlns:cx6="http://schemas.microsoft.com/office/drawing/2016/5/12/chartex" xmlns:cx7="http://schemas.microsoft.com/office/drawing/2016/5/13/chartex" xmlns:cx8="http://schemas.microsoft.com/office/drawing/2016/5/14/chartex" xmlns:mc="http://schemas.openxmlformats.org/markup-compatibility/2006" xmlns:aink="http://schemas.microsoft.com/office/drawing/2016/ink" xmlns:am3d="http://schemas.microsoft.com/office/drawing/2017/model3d" xmlns:o="urn:schemas-microsoft-com:office:office" xmlns:oel="http://schemas.microsoft.com/office/2019/extlst" xmlns:r="http://schemas.openxmlformats.org/officeDocument/2006/relationships" xmlns:m="http://schemas.openxmlformats.org/officeDocument/2006/math" xmlns:v="urn:schemas-microsoft-com:vml" xmlns:wp14="http://schemas.microsoft.com/office/word/2010/wordprocessingDrawing" xmlns:wp="http://schemas.openxmlformats.org/drawingml/2006/wordprocessingDrawing" xmlns:w10="urn:schemas-microsoft-com:office:word" xmlns:w="http://schemas.openxmlformats.org/wordprocessingml/2006/main" xmlns:w14="http://schemas.microsoft.com/office/word/2010/wordml" xmlns:w15="http://schemas.microsoft.com/office/word/2012/wordml" xmlns:w16cei="http://schemas.microsoft.com/office/word/2026/wordml/cei" xmlns:w16cex="http://schemas.microsoft.com/office/word/2018/wordml/cex" xmlns:w16cid="http://schemas.microsoft.com/office/word/2016/wordml/cid" xmlns:w16="http://schemas.microsoft.com/office/word/2018/wordml" xmlns:w16du="http://schemas.microsoft.com/office/word/2023/wordml/word16du" xmlns:w16sdtdh="http://schemas.microsoft.com/office/word/2020/wordml/sdtdatahash" xmlns:w16sdtfl="http://schemas.microsoft.com/office/word/2024/wordml/sdtformatlock" xmlns:w16se="http://schemas.microsoft.com/office/word/2015/wordml/symex" xmlns:wpg="http://schemas.microsoft.com/office/word/2010/wordprocessingGroup" xmlns:wpi="http://schemas.microsoft.com/office/word/2010/wordprocessingInk" xmlns:wne="http://schemas.microsoft.com/office/word/2006/wordml" xmlns:wps="http://schemas.microsoft.com/office/word/2010/wordprocessingShape" mc:Ignorable="w14 w15 w16se w16cid w16 w16cex w16sdtdh w16sdtfl w16du wp14">
   <w:endnote w:type="separator" w:id="-1">
     <w:p>
       <w:pPr>
@@ -9356,7 +9352,7 @@
 </file>
 
 <file path=word/footer1.xml><?xml version="1.0" encoding="utf-8"?>
-<w:ftr xmlns:wpc="http://schemas.microsoft.com/office/word/2010/wordprocessingCanvas" xmlns:cx="http://schemas.microsoft.com/office/drawing/2014/chartex" xmlns:cx1="http://schemas.microsoft.com/office/drawing/2015/9/8/chartex" xmlns:cx2="http://schemas.microsoft.com/office/drawing/2015/10/21/chartex" xmlns:cx3="http://schemas.microsoft.com/office/drawing/2016/5/9/chartex" xmlns:cx4="http://schemas.microsoft.com/office/drawing/2016/5/10/chartex" xmlns:cx5="http://schemas.microsoft.com/office/drawing/2016/5/11/chartex" xmlns:cx6="http://schemas.microsoft.com/office/drawing/2016/5/12/chartex" xmlns:cx7="http://schemas.microsoft.com/office/drawing/2016/5/13/chartex" xmlns:cx8="http://schemas.microsoft.com/office/drawing/2016/5/14/chartex" xmlns:mc="http://schemas.openxmlformats.org/markup-compatibility/2006" xmlns:aink="http://schemas.microsoft.com/office/drawing/2016/ink" xmlns:am3d="http://schemas.microsoft.com/office/drawing/2017/model3d" xmlns:o="urn:schemas-microsoft-com:office:office" xmlns:oel="http://schemas.microsoft.com/office/2019/extlst" xmlns:r="http://schemas.openxmlformats.org/officeDocument/2006/relationships" xmlns:m="http://schemas.openxmlformats.org/officeDocument/2006/math" xmlns:v="urn:schemas-microsoft-com:vml" xmlns:wp14="http://schemas.microsoft.com/office/word/2010/wordprocessingDrawing" xmlns:wp="http://schemas.openxmlformats.org/drawingml/2006/wordprocessingDrawing" xmlns:w10="urn:schemas-microsoft-com:office:word" xmlns:w="http://schemas.openxmlformats.org/wordprocessingml/2006/main" xmlns:w14="http://schemas.microsoft.com/office/word/2010/wordml" xmlns:w15="http://schemas.microsoft.com/office/word/2012/wordml" xmlns:w16cex="http://schemas.microsoft.com/office/word/2018/wordml/cex" xmlns:w16cid="http://schemas.microsoft.com/office/word/2016/wordml/cid" xmlns:w16="http://schemas.microsoft.com/office/word/2018/wordml" xmlns:w16du="http://schemas.microsoft.com/office/word/2023/wordml/word16du" xmlns:w16sdtdh="http://schemas.microsoft.com/office/word/2020/wordml/sdtdatahash" xmlns:w16sdtfl="http://schemas.microsoft.com/office/word/2024/wordml/sdtformatlock" xmlns:w16se="http://schemas.microsoft.com/office/word/2015/wordml/symex" xmlns:wpg="http://schemas.microsoft.com/office/word/2010/wordprocessingGroup" xmlns:wpi="http://schemas.microsoft.com/office/word/2010/wordprocessingInk" xmlns:wne="http://schemas.microsoft.com/office/word/2006/wordml" xmlns:wps="http://schemas.microsoft.com/office/word/2010/wordprocessingShape" mc:Ignorable="w14 w15 w16se w16cid w16 w16cex w16sdtdh w16sdtfl w16du wp14">
+<w:ftr xmlns:wpc="http://schemas.microsoft.com/office/word/2010/wordprocessingCanvas" xmlns:cx="http://schemas.microsoft.com/office/drawing/2014/chartex" xmlns:cx1="http://schemas.microsoft.com/office/drawing/2015/9/8/chartex" xmlns:cx2="http://schemas.microsoft.com/office/drawing/2015/10/21/chartex" xmlns:cx3="http://schemas.microsoft.com/office/drawing/2016/5/9/chartex" xmlns:cx4="http://schemas.microsoft.com/office/drawing/2016/5/10/chartex" xmlns:cx5="http://schemas.microsoft.com/office/drawing/2016/5/11/chartex" xmlns:cx6="http://schemas.microsoft.com/office/drawing/2016/5/12/chartex" xmlns:cx7="http://schemas.microsoft.com/office/drawing/2016/5/13/chartex" xmlns:cx8="http://schemas.microsoft.com/office/drawing/2016/5/14/chartex" xmlns:mc="http://schemas.openxmlformats.org/markup-compatibility/2006" xmlns:aink="http://schemas.microsoft.com/office/drawing/2016/ink" xmlns:am3d="http://schemas.microsoft.com/office/drawing/2017/model3d" xmlns:o="urn:schemas-microsoft-com:office:office" xmlns:oel="http://schemas.microsoft.com/office/2019/extlst" xmlns:r="http://schemas.openxmlformats.org/officeDocument/2006/relationships" xmlns:m="http://schemas.openxmlformats.org/officeDocument/2006/math" xmlns:v="urn:schemas-microsoft-com:vml" xmlns:wp14="http://schemas.microsoft.com/office/word/2010/wordprocessingDrawing" xmlns:wp="http://schemas.openxmlformats.org/drawingml/2006/wordprocessingDrawing" xmlns:w10="urn:schemas-microsoft-com:office:word" xmlns:w="http://schemas.openxmlformats.org/wordprocessingml/2006/main" xmlns:w14="http://schemas.microsoft.com/office/word/2010/wordml" xmlns:w15="http://schemas.microsoft.com/office/word/2012/wordml" xmlns:w16cei="http://schemas.microsoft.com/office/word/2026/wordml/cei" xmlns:w16cex="http://schemas.microsoft.com/office/word/2018/wordml/cex" xmlns:w16cid="http://schemas.microsoft.com/office/word/2016/wordml/cid" xmlns:w16="http://schemas.microsoft.com/office/word/2018/wordml" xmlns:w16du="http://schemas.microsoft.com/office/word/2023/wordml/word16du" xmlns:w16sdtdh="http://schemas.microsoft.com/office/word/2020/wordml/sdtdatahash" xmlns:w16sdtfl="http://schemas.microsoft.com/office/word/2024/wordml/sdtformatlock" xmlns:w16se="http://schemas.microsoft.com/office/word/2015/wordml/symex" xmlns:wpg="http://schemas.microsoft.com/office/word/2010/wordprocessingGroup" xmlns:wpi="http://schemas.microsoft.com/office/word/2010/wordprocessingInk" xmlns:wne="http://schemas.microsoft.com/office/word/2006/wordml" xmlns:wps="http://schemas.microsoft.com/office/word/2010/wordprocessingShape" mc:Ignorable="w14 w15 w16se w16cid w16 w16cex w16sdtdh w16sdtfl w16du wp14">
   <w:sdt>
     <w:sdtPr>
       <w:rPr>
@@ -9535,7 +9531,7 @@
 </file>
 
 <file path=word/footnotes.xml><?xml version="1.0" encoding="utf-8"?>
-<w:footnotes xmlns:wpc="http://schemas.microsoft.com/office/word/2010/wordprocessingCanvas" xmlns:cx="http://schemas.microsoft.com/office/drawing/2014/chartex" xmlns:cx1="http://schemas.microsoft.com/office/drawing/2015/9/8/chartex" xmlns:cx2="http://schemas.microsoft.com/office/drawing/2015/10/21/chartex" xmlns:cx3="http://schemas.microsoft.com/office/drawing/2016/5/9/chartex" xmlns:cx4="http://schemas.microsoft.com/office/drawing/2016/5/10/chartex" xmlns:cx5="http://schemas.microsoft.com/office/drawing/2016/5/11/chartex" xmlns:cx6="http://schemas.microsoft.com/office/drawing/2016/5/12/chartex" xmlns:cx7="http://schemas.microsoft.com/office/drawing/2016/5/13/chartex" xmlns:cx8="http://schemas.microsoft.com/office/drawing/2016/5/14/chartex" xmlns:mc="http://schemas.openxmlformats.org/markup-compatibility/2006" xmlns:aink="http://schemas.microsoft.com/office/drawing/2016/ink" xmlns:am3d="http://schemas.microsoft.com/office/drawing/2017/model3d" xmlns:o="urn:schemas-microsoft-com:office:office" xmlns:oel="http://schemas.microsoft.com/office/2019/extlst" xmlns:r="http://schemas.openxmlformats.org/officeDocument/2006/relationships" xmlns:m="http://schemas.openxmlformats.org/officeDocument/2006/math" xmlns:v="urn:schemas-microsoft-com:vml" xmlns:wp14="http://schemas.microsoft.com/office/word/2010/wordprocessingDrawing" xmlns:wp="http://schemas.openxmlformats.org/drawingml/2006/wordprocessingDrawing" xmlns:w10="urn:schemas-microsoft-com:office:word" xmlns:w="http://schemas.openxmlformats.org/wordprocessingml/2006/main" xmlns:w14="http://schemas.microsoft.com/office/word/2010/wordml" xmlns:w15="http://schemas.microsoft.com/office/word/2012/wordml" xmlns:w16cex="http://schemas.microsoft.com/office/word/2018/wordml/cex" xmlns:w16cid="http://schemas.microsoft.com/office/word/2016/wordml/cid" xmlns:w16="http://schemas.microsoft.com/office/word/2018/wordml" xmlns:w16du="http://schemas.microsoft.com/office/word/2023/wordml/word16du" xmlns:w16sdtdh="http://schemas.microsoft.com/office/word/2020/wordml/sdtdatahash" xmlns:w16sdtfl="http://schemas.microsoft.com/office/word/2024/wordml/sdtformatlock" xmlns:w16se="http://schemas.microsoft.com/office/word/2015/wordml/symex" xmlns:wpg="http://schemas.microsoft.com/office/word/2010/wordprocessingGroup" xmlns:wpi="http://schemas.microsoft.com/office/word/2010/wordprocessingInk" xmlns:wne="http://schemas.microsoft.com/office/word/2006/wordml" xmlns:wps="http://schemas.microsoft.com/office/word/2010/wordprocessingShape" mc:Ignorable="w14 w15 w16se w16cid w16 w16cex w16sdtdh w16sdtfl w16du wp14">
+<w:footnotes xmlns:wpc="http://schemas.microsoft.com/office/word/2010/wordprocessingCanvas" xmlns:cx="http://schemas.microsoft.com/office/drawing/2014/chartex" xmlns:cx1="http://schemas.microsoft.com/office/drawing/2015/9/8/chartex" xmlns:cx2="http://schemas.microsoft.com/office/drawing/2015/10/21/chartex" xmlns:cx3="http://schemas.microsoft.com/office/drawing/2016/5/9/chartex" xmlns:cx4="http://schemas.microsoft.com/office/drawing/2016/5/10/chartex" xmlns:cx5="http://schemas.microsoft.com/office/drawing/2016/5/11/chartex" xmlns:cx6="http://schemas.microsoft.com/office/drawing/2016/5/12/chartex" xmlns:cx7="http://schemas.microsoft.com/office/drawing/2016/5/13/chartex" xmlns:cx8="http://schemas.microsoft.com/office/drawing/2016/5/14/chartex" xmlns:mc="http://schemas.openxmlformats.org/markup-compatibility/2006" xmlns:aink="http://schemas.microsoft.com/office/drawing/2016/ink" xmlns:am3d="http://schemas.microsoft.com/office/drawing/2017/model3d" xmlns:o="urn:schemas-microsoft-com:office:office" xmlns:oel="http://schemas.microsoft.com/office/2019/extlst" xmlns:r="http://schemas.openxmlformats.org/officeDocument/2006/relationships" xmlns:m="http://schemas.openxmlformats.org/officeDocument/2006/math" xmlns:v="urn:schemas-microsoft-com:vml" xmlns:wp14="http://schemas.microsoft.com/office/word/2010/wordprocessingDrawing" xmlns:wp="http://schemas.openxmlformats.org/drawingml/2006/wordprocessingDrawing" xmlns:w10="urn:schemas-microsoft-com:office:word" xmlns:w="http://schemas.openxmlformats.org/wordprocessingml/2006/main" xmlns:w14="http://schemas.microsoft.com/office/word/2010/wordml" xmlns:w15="http://schemas.microsoft.com/office/word/2012/wordml" xmlns:w16cei="http://schemas.microsoft.com/office/word/2026/wordml/cei" xmlns:w16cex="http://schemas.microsoft.com/office/word/2018/wordml/cex" xmlns:w16cid="http://schemas.microsoft.com/office/word/2016/wordml/cid" xmlns:w16="http://schemas.microsoft.com/office/word/2018/wordml" xmlns:w16du="http://schemas.microsoft.com/office/word/2023/wordml/word16du" xmlns:w16sdtdh="http://schemas.microsoft.com/office/word/2020/wordml/sdtdatahash" xmlns:w16sdtfl="http://schemas.microsoft.com/office/word/2024/wordml/sdtformatlock" xmlns:w16se="http://schemas.microsoft.com/office/word/2015/wordml/symex" xmlns:wpg="http://schemas.microsoft.com/office/word/2010/wordprocessingGroup" xmlns:wpi="http://schemas.microsoft.com/office/word/2010/wordprocessingInk" xmlns:wne="http://schemas.microsoft.com/office/word/2006/wordml" xmlns:wps="http://schemas.microsoft.com/office/word/2010/wordprocessingShape" mc:Ignorable="w14 w15 w16se w16cid w16 w16cex w16sdtdh w16sdtfl w16du wp14">
   <w:footnote w:type="separator" w:id="-1">
     <w:p>
       <w:pPr>
@@ -9560,7 +9556,7 @@
 </file>
 
 <file path=word/numbering.xml><?xml version="1.0" encoding="utf-8"?>
-<w:numbering xmlns:wpc="http://schemas.microsoft.com/office/word/2010/wordprocessingCanvas" xmlns:cx="http://schemas.microsoft.com/office/drawing/2014/chartex" xmlns:cx1="http://schemas.microsoft.com/office/drawing/2015/9/8/chartex" xmlns:cx2="http://schemas.microsoft.com/office/drawing/2015/10/21/chartex" xmlns:cx3="http://schemas.microsoft.com/office/drawing/2016/5/9/chartex" xmlns:cx4="http://schemas.microsoft.com/office/drawing/2016/5/10/chartex" xmlns:cx5="http://schemas.microsoft.com/office/drawing/2016/5/11/chartex" xmlns:cx6="http://schemas.microsoft.com/office/drawing/2016/5/12/chartex" xmlns:cx7="http://schemas.microsoft.com/office/drawing/2016/5/13/chartex" xmlns:cx8="http://schemas.microsoft.com/office/drawing/2016/5/14/chartex" xmlns:mc="http://schemas.openxmlformats.org/markup-compatibility/2006" xmlns:aink="http://schemas.microsoft.com/office/drawing/2016/ink" xmlns:am3d="http://schemas.microsoft.com/office/drawing/2017/model3d" xmlns:o="urn:schemas-microsoft-com:office:office" xmlns:oel="http://schemas.microsoft.com/office/2019/extlst" xmlns:r="http://schemas.openxmlformats.org/officeDocument/2006/relationships" xmlns:m="http://schemas.openxmlformats.org/officeDocument/2006/math" xmlns:v="urn:schemas-microsoft-com:vml" xmlns:wp14="http://schemas.microsoft.com/office/word/2010/wordprocessingDrawing" xmlns:wp="http://schemas.openxmlformats.org/drawingml/2006/wordprocessingDrawing" xmlns:w10="urn:schemas-microsoft-com:office:word" xmlns:w="http://schemas.openxmlformats.org/wordprocessingml/2006/main" xmlns:w14="http://schemas.microsoft.com/office/word/2010/wordml" xmlns:w15="http://schemas.microsoft.com/office/word/2012/wordml" xmlns:w16cex="http://schemas.microsoft.com/office/word/2018/wordml/cex" xmlns:w16cid="http://schemas.microsoft.com/office/word/2016/wordml/cid" xmlns:w16="http://schemas.microsoft.com/office/word/2018/wordml" xmlns:w16du="http://schemas.microsoft.com/office/word/2023/wordml/word16du" xmlns:w16sdtdh="http://schemas.microsoft.com/office/word/2020/wordml/sdtdatahash" xmlns:w16sdtfl="http://schemas.microsoft.com/office/word/2024/wordml/sdtformatlock" xmlns:w16se="http://schemas.microsoft.com/office/word/2015/wordml/symex" xmlns:wpg="http://schemas.microsoft.com/office/word/2010/wordprocessingGroup" xmlns:wpi="http://schemas.microsoft.com/office/word/2010/wordprocessingInk" xmlns:wne="http://schemas.microsoft.com/office/word/2006/wordml" xmlns:wps="http://schemas.microsoft.com/office/word/2010/wordprocessingShape" mc:Ignorable="w14 w15 w16se w16cid w16 w16cex w16sdtdh w16sdtfl w16du wp14">
+<w:numbering xmlns:wpc="http://schemas.microsoft.com/office/word/2010/wordprocessingCanvas" xmlns:cx="http://schemas.microsoft.com/office/drawing/2014/chartex" xmlns:cx1="http://schemas.microsoft.com/office/drawing/2015/9/8/chartex" xmlns:cx2="http://schemas.microsoft.com/office/drawing/2015/10/21/chartex" xmlns:cx3="http://schemas.microsoft.com/office/drawing/2016/5/9/chartex" xmlns:cx4="http://schemas.microsoft.com/office/drawing/2016/5/10/chartex" xmlns:cx5="http://schemas.microsoft.com/office/drawing/2016/5/11/chartex" xmlns:cx6="http://schemas.microsoft.com/office/drawing/2016/5/12/chartex" xmlns:cx7="http://schemas.microsoft.com/office/drawing/2016/5/13/chartex" xmlns:cx8="http://schemas.microsoft.com/office/drawing/2016/5/14/chartex" xmlns:mc="http://schemas.openxmlformats.org/markup-compatibility/2006" xmlns:aink="http://schemas.microsoft.com/office/drawing/2016/ink" xmlns:am3d="http://schemas.microsoft.com/office/drawing/2017/model3d" xmlns:o="urn:schemas-microsoft-com:office:office" xmlns:oel="http://schemas.microsoft.com/office/2019/extlst" xmlns:r="http://schemas.openxmlformats.org/officeDocument/2006/relationships" xmlns:m="http://schemas.openxmlformats.org/officeDocument/2006/math" xmlns:v="urn:schemas-microsoft-com:vml" xmlns:wp14="http://schemas.microsoft.com/office/word/2010/wordprocessingDrawing" xmlns:wp="http://schemas.openxmlformats.org/drawingml/2006/wordprocessingDrawing" xmlns:w10="urn:schemas-microsoft-com:office:word" xmlns:w="http://schemas.openxmlformats.org/wordprocessingml/2006/main" xmlns:w14="http://schemas.microsoft.com/office/word/2010/wordml" xmlns:w15="http://schemas.microsoft.com/office/word/2012/wordml" xmlns:w16cei="http://schemas.microsoft.com/office/word/2026/wordml/cei" xmlns:w16cex="http://schemas.microsoft.com/office/word/2018/wordml/cex" xmlns:w16cid="http://schemas.microsoft.com/office/word/2016/wordml/cid" xmlns:w16="http://schemas.microsoft.com/office/word/2018/wordml" xmlns:w16du="http://schemas.microsoft.com/office/word/2023/wordml/word16du" xmlns:w16sdtdh="http://schemas.microsoft.com/office/word/2020/wordml/sdtdatahash" xmlns:w16sdtfl="http://schemas.microsoft.com/office/word/2024/wordml/sdtformatlock" xmlns:w16se="http://schemas.microsoft.com/office/word/2015/wordml/symex" xmlns:wpg="http://schemas.microsoft.com/office/word/2010/wordprocessingGroup" xmlns:wpi="http://schemas.microsoft.com/office/word/2010/wordprocessingInk" xmlns:wne="http://schemas.microsoft.com/office/word/2006/wordml" xmlns:wps="http://schemas.microsoft.com/office/word/2010/wordprocessingShape" mc:Ignorable="w14 w15 w16se w16cid w16 w16cex w16sdtdh w16sdtfl w16du wp14">
   <w:abstractNum w:abstractNumId="0" w15:restartNumberingAfterBreak="0">
     <w:nsid w:val="00DC2B11"/>
     <w:multiLevelType w:val="hybridMultilevel"/>

</xml_diff>

<commit_message>
Aggiunge penalità mancato inserimento formazione (art. 8.5) e investimento premi in strumenti finanziari (art. 3.3)
Co-Authored-By: Claude Opus 5 <noreply@anthropic.com>
</commit_message>
<xml_diff>
--- a/originali/Regolamento Fantacluster 2025-2026.docx
+++ b/originali/Regolamento Fantacluster 2025-2026.docx
@@ -2714,6 +2714,31 @@
     <w:p>
       <w:pPr>
         <w:pStyle w:val="Paragrafoelenco"/>
+        <w:numPr>
+          <w:ilvl w:val="1"/>
+          <w:numId w:val="5"/>
+        </w:numPr>
+        <w:spacing w:after="0"/>
+        <w:ind w:left="851"/>
+        <w:jc w:val="both"/>
+        <w:rPr>
+          <w:sz w:val="20"/>
+          <w:szCs w:val="20"/>
+          <w:lang w:val="it-IT"/>
+        </w:rPr>
+      </w:pPr>
+      <w:r>
+        <w:rPr>
+          <w:sz w:val="20"/>
+          <w:szCs w:val="20"/>
+          <w:lang w:val="it-IT"/>
+        </w:rPr>
+        <w:t xml:space="preserve">I premi di cui alla Tabella B, anziché essere corrisposti in denaro, vengono investiti in strumenti finanziari. La scelta degli strumenti finanziari è decisa collegialmente da tutti i Fantallenatori durante l’asta di cui all’art. 4.</w:t>
+      </w:r>
+    </w:p>
+    <w:p>
+      <w:pPr>
+        <w:pStyle w:val="Paragrafoelenco"/>
         <w:spacing w:after="0"/>
         <w:ind w:left="851"/>
         <w:jc w:val="both"/>
@@ -5347,6 +5372,31 @@
           <w:lang w:val="it-IT"/>
         </w:rPr>
         <w:t>Il limite temporale per l’inserimento e la modifica della formazione coincide con l’inizio della giornata (fischio d’inizio della prima gara del turno). Trascorso tale termine non è più consentita alcuna modifica alla formazione schierata.</w:t>
+      </w:r>
+    </w:p>
+    <w:p>
+      <w:pPr>
+        <w:pStyle w:val="Paragrafoelenco"/>
+        <w:numPr>
+          <w:ilvl w:val="1"/>
+          <w:numId w:val="5"/>
+        </w:numPr>
+        <w:spacing w:after="0"/>
+        <w:ind w:left="851"/>
+        <w:jc w:val="both"/>
+        <w:rPr>
+          <w:sz w:val="20"/>
+          <w:szCs w:val="20"/>
+          <w:lang w:val="it-IT"/>
+        </w:rPr>
+      </w:pPr>
+      <w:r>
+        <w:rPr>
+          <w:sz w:val="20"/>
+          <w:szCs w:val="20"/>
+          <w:lang w:val="it-IT"/>
+        </w:rPr>
+        <w:t xml:space="preserve">In caso di mancato inserimento della formazione entro il termine di cui all’art. 8.4, il Fantallenatore viene penalizzato di 1 (un) punto nella classifica Fantacluster (campionato) per ogni giornata in cui si verifica l’inadempienza.</w:t>
       </w:r>
     </w:p>
     <w:p>

</xml_diff>